<commit_message>
Zechariah 2nd re-audit: 13 MSG restorations (ch1-5,8,10,11,13), EN/KO mirrored, slang cleanup, GDocs created 14/14 verified
</commit_message>
<xml_diff>
--- a/gdocs_build/Zechariah.docx
+++ b/gdocs_build/Zechariah.docx
@@ -124,7 +124,7 @@
               <w:rPr>
                 <w:sz w:val="18"/>
               </w:rPr>
-              <w:t>So, in the second year that Darius was king, around October, God's message hit up the prophet Zechariah (son of Berechiah, who was the son of Iddo). God was like, "I was seriously not happy with your ancestors. So, tell the people this message from the God of Angel Armies: 'Come back to me, and I'll come back to you. Don't be like your parents. The prophets back in the day told them, 'A message from the God of Angel Armies: Drop your messed-up life. Stop the evil stuff you're doing.' But they straight up ignored everything I said, being stubborn and refusing to listen.'</w:t>
+              <w:t>So, in the eighth month of the second year that Darius was king—around October, God's message hit up the prophet Zechariah (son of Berechiah, who was the son of Iddo). God was like, "I was seriously not happy with your ancestors. So, tell the people this message from the God of Angel Armies: 'Come back to me, and I'll come back to you. Don't be like your parents. The prophets back in the day told them, 'A message from the God of Angel Armies: Drop your messed-up life. Stop the evil stuff you're doing.' But they straight up ignored everything I said, being stubborn and refusing to listen.'</w:t>
             </w:r>
           </w:p>
         </w:tc>
@@ -1236,7 +1236,7 @@
               <w:rPr>
                 <w:sz w:val="18"/>
               </w:rPr>
-              <w:t>내가 "이 사람들은 다 뭐임?" 하고 물어봤음.</w:t>
+              <w:t>내가 "이 사람들은 도대체 뭐예요?" 하고 물어봤음.</w:t>
             </w:r>
           </w:p>
         </w:tc>
@@ -1422,7 +1422,7 @@
               <w:rPr>
                 <w:sz w:val="18"/>
               </w:rPr>
-              <w:t>I looked up and, no cap, there was a dude holding a tape measure. I was like, “Yo, what are you up to?”</w:t>
+              <w:t>I looked up and saw a guy holding a tape measure. I was like, “Yo, what are you up to?”</w:t>
             </w:r>
           </w:p>
         </w:tc>
@@ -1658,7 +1658,7 @@
               <w:rPr>
                 <w:sz w:val="18"/>
               </w:rPr>
-              <w:t>“일어나! 거기서 당장 빠져나와!” 하나님이 그렇게 말씀하셔. “네가 멀리 쫓겨났던 북쪽 땅에서 돌아와라. 내가 너희를 하늘의 사방으로 흩어버렸었다.” 하나님의 선포래. “시온아, 바빌론에서 탈출해서 집으로 돌아와! 지금 당장!”</w:t>
+              <w:t>“일어나! 거기서 당장 빠져나와!” 하나님이 그렇게 말씀하셔. “먼 유배지에서 돌아와라. 내가 너희를 하늘의 사방으로 흩어버렸었다.” 하나님의 선포래. “시온아, 바빌론에서 탈출해서 집으로 돌아와! 지금 당장!”</w:t>
             </w:r>
           </w:p>
         </w:tc>
@@ -1706,7 +1706,7 @@
               <w:rPr>
                 <w:sz w:val="18"/>
               </w:rPr>
-              <w:t>God-of-the-Angel-Armies, the One of Glory who sent me on my mission, had this to say about the godless nations that totally stripped you and left you homeless: “Anyone who hits you, hits me—it’s like they’re poking me in the eye. Yeah, and when the time is right, I’ll give the signal and they’ll get stripped and thrown out by their own servants.” Then you’ll know for real that God-of-the-Angel-Armies sent me on this mission.</w:t>
+              <w:t>God-of-the-Angel-Armies, the One of Glory who sent me on my mission, had this to say about the godless nations that totally stripped you and left you homeless: “Anyone who hits you, hits me—it bloodies my nose, blackens my eye. Yeah, and when the time is right, I’ll give the signal and they’ll get stripped and thrown out by their own servants.” Then you’ll know for real that God-of-the-Angel-Armies sent me on this mission.</w:t>
             </w:r>
           </w:p>
         </w:tc>
@@ -1729,7 +1729,7 @@
               <w:rPr>
                 <w:sz w:val="18"/>
               </w:rPr>
-              <w:t>너희를 약탈하고 집 없게 만든 이방 민족들에 대해, 영광의 하나님, 만군의 주님께서 나를 보내시며 이렇게 말씀하셨어. “너희를 건드리는 자는 내 눈동자를 건드리는 것이다. 진짜. 그리고 때가 되면 내가 손을 휘두를 건데, 그러면 그들이 자기들 종한테 약탈당하게 될 거다.” 그때가 되면 너희는 만군의 주님께서 나를 보내셨다는 걸 진짜로 알게 될 거래.</w:t>
+              <w:t>너희를 약탈하고 집 없게 만든 이방 민족들에 대해, 영광의 하나님, 만군의 주님께서 나를 보내시며 이렇게 말씀하셨어. “너희를 때리는 자는 나를 때리는 것이다—내 코피를 터뜨리고 내 눈에 멍을 들게 하는 것이다. 그리고 때가 되면 내가 손을 휘두를 건데, 그러면 그들이 자기들 종한테 약탈당하게 될 거다.” 그때가 되면 너희는 만군의 주님께서 나를 보내셨다는 걸 진짜로 알게 될 거래.</w:t>
             </w:r>
           </w:p>
         </w:tc>
@@ -2128,7 +2128,7 @@
               <w:rPr>
                 <w:sz w:val="18"/>
               </w:rPr>
-              <w:t>So there's Joshua, standing in front of the angel, and his clothes are just nasty, like he's been mud-wrestling. The angel turns to his crew and says, 'Get these gross clothes off him.' Then he looks at Joshua and says, 'See? I've totally wiped away your sin and I'm hooking you up with a fresh new fit.'</w:t>
+              <w:t>So there's Joshua, standing in front of the angel, and his clothes are just nasty, like he's been mud-wrestling. The angel turns to his crew and says, 'Get these gross clothes off him.' Then he looks at Joshua and says, 'See? I've totally wiped away your sin and I'm giving you a clean new outfit.'</w:t>
             </w:r>
           </w:p>
         </w:tc>
@@ -2341,7 +2341,7 @@
               <w:rPr>
                 <w:sz w:val="18"/>
               </w:rPr>
-              <w:t>'Listen up, High Priest Joshua—this is for you and your crew sitting here with you, 'cause you guys are a sign of what's coming. Here's the deal: I'm about to introduce my servant, Branch. And get this: I'm putting this special stone in front of Joshua, a single stone with seven eyes on it.' This is a decree from the God-of-the-Angel-Armies, who says, 'I'm gonna engrave a message on it myself: I'm going to wipe out all the sin from this land, like, all at once, in a single day.'</w:t>
+              <w:t>'Listen up, High Priest Joshua—this is for you and your crew sitting here with you, 'cause you guys are in on this, too. You're a sign of what's coming. Here's the deal: I'm about to introduce my servant, Branch. And get this: I'm putting this special stone in front of Joshua, a single stone with seven eyes on it.' This is a decree from the God-of-the-Angel-Armies, who says, 'I'm gonna engrave a message on it myself: I'm going to wipe out all the sin from this land, like, all at once, in a single day.'</w:t>
             </w:r>
           </w:p>
         </w:tc>
@@ -2364,7 +2364,7 @@
               <w:rPr>
                 <w:sz w:val="18"/>
               </w:rPr>
-              <w:t>"'잘 들어, 대제사장 여호수아야. 너랑 네 앞에 앉은 네 친구들 말이야. 너희는 앞으로 일어날 일의 예고편 같은 거거든. 내가 이제 내 종 '새싹'을 나타나게 할 거야. 그리고 잘 봐. 내가 여호수아 앞에 돌 하나를 두는데, 눈이 일곱 개 달린 돌이야.' 만군의 여호와가 선포했어. '내가 거기에 직접 글씨를 새길 건데, "이 땅의 죄를 하루 만에 싹 다 없애겠다"는 말이야.'"</w:t>
+              <w:t>"'잘 들어, 대제사장 여호수아야. 너랑 네 앞에 앉은 네 친구들 말이야. 너희도 이 일에 함께하고 있어. 앞으로 일어날 일의 예고편 같은 거거든. 내가 이제 내 종 '새싹'을 나타나게 할 거야. 그리고 잘 봐. 내가 여호수아 앞에 돌 하나를 두는데, 눈이 일곱 개 달린 돌이야.' 만군의 여호와가 선포했어. '내가 거기에 직접 글씨를 새길 건데, "이 땅의 죄를 하루 만에 싹 다 없애겠다"는 말이야.'"</w:t>
             </w:r>
           </w:p>
         </w:tc>
@@ -2412,7 +2412,7 @@
               <w:rPr>
                 <w:sz w:val="18"/>
               </w:rPr>
-              <w:t>'When that day comes, everyone's gonna be chill with each other, inviting their neighbors over for a hangout, just visiting and vibing on each other's porches.'</w:t>
+              <w:t>'When that day comes, everyone's gonna be chill with each other, inviting their neighbors over for a hangout, just hanging out on each other's porches.'</w:t>
             </w:r>
           </w:p>
         </w:tc>
@@ -3000,7 +3000,7 @@
               <w:rPr>
                 <w:sz w:val="18"/>
               </w:rPr>
-              <w:t>Then he explained, “This is God's message for Zerubbabel: It's not about your own strength or power. It's all about my Spirit, says the LORD of Heaven's Armies. So that huge mountain in your way? It's gonna look like a tiny little hill next to Zerubbabel. He's gonna lay the final stone of the temple, and everyone's gonna be cheering, ‘Let's go! Let's go! Get it done!’”</w:t>
+              <w:t>Then he explained, “This is God's message for Zerubbabel: It's not about your own strength or power. It's all about my Spirit, says the LORD of Heaven's Armies. So that huge mountain in your way? It's gonna look like a tiny little hill next to Zerubbabel. He's gonna set the Cornerstone in place, and everyone's gonna be cheering, ‘Let's go! Let's go! Get it done!’”</w:t>
             </w:r>
           </w:p>
         </w:tc>
@@ -3023,7 +3023,7 @@
               <w:rPr>
                 <w:sz w:val="18"/>
               </w:rPr>
-              <w:t>그러자 천사가 말했음. "이게 바로 스룹바벨한테 보내는 하나님의 메시지야. '네 힘으로 억지로 하는 게 아니야. 오직 나의 영으로만 되는 거다.' 만군의 주가 말했대. '그러니까 너, 거대한 산아, 네가 뭔데? 스룹바벨 옆에 있으면 넌 그냥 작은 언덕일 뿐이야. 그가 머릿돌을 놓을 때 사람들이 '진짜 큰! 진짜 큰! 해내자!' 하고 소리칠 거다.'"</w:t>
+              <w:t>그러자 천사가 말했음. "이게 바로 스룹바벨한테 보내는 하나님의 메시지야. '네 힘으로 억지로 하는 게 아니야. 오직 나의 영으로만 되는 거다.' 만군의 주가 말했대. '그러니까 너, 거대한 산아, 네가 뭔데? 스룹바벨 옆에 있으면 넌 그냥 작은 언덕일 뿐이야. 그가 머릿돌을 놓을 때 사람들이 '가자! 가자! 해내자!' 하고 소리칠 거다.'"</w:t>
             </w:r>
           </w:p>
         </w:tc>
@@ -3442,7 +3442,7 @@
               <w:rPr>
                 <w:sz w:val="18"/>
               </w:rPr>
-              <w:t>He said, “These are the two who are anointed to serve the Lord of all the earth, supplying his light to the whole world.”</w:t>
+              <w:t>He said, “These are the two who stand beside the Lord of all the earth, supplying golden lamp oil to the whole world.”</w:t>
             </w:r>
           </w:p>
         </w:tc>
@@ -3465,7 +3465,7 @@
               <w:rPr>
                 <w:sz w:val="18"/>
               </w:rPr>
-              <w:t>천사가 말했음. "이 둘은 온 세상의 주님 곁에 서서 황금 등잔 기름을 온 세상에 공급하도록 기름 부음 받은 자들이다."</w:t>
+              <w:t>천사가 말했음. "이 둘은 온 세상의 주님 곁에 서서 황금 등잔 기름을 온 세상에 공급하는 자들이다."</w:t>
             </w:r>
           </w:p>
         </w:tc>
@@ -3603,7 +3603,7 @@
               <w:rPr>
                 <w:sz w:val="18"/>
               </w:rPr>
-              <w:t>내가 다시 고개를 들어보니까 완전 대박인 게 보이는 거임. 날아다니는 책이었음! 진짜 책이 날아다녔다니까?</w:t>
+              <w:t>내가 다시 고개를 들어보니까 완전 놀라운 게 보이는 거임. 날아다니는 책이었음! 진짜 책이 날아다녔다니까?</w:t>
             </w:r>
           </w:p>
         </w:tc>
@@ -3801,7 +3801,7 @@
               <w:rPr>
                 <w:sz w:val="18"/>
               </w:rPr>
-              <w:t>He explained, "This scroll is basically the judgment call going out to all the thieves and liars in the world. One side of the scroll is for the thieves, and the other side is for the liars. God sent it out, and it's going to fly into the house of every single thief and liar, land there, and completely wreck the place, from the roof to the foundation."</w:t>
+              <w:t>He explained, "This scroll is basically the judgment call going out to all the thieves and liars in the world. The first half of the scroll is for the thieves, and the second half is for the liars. God sent it out, and it's going to fly into the house of every single thief and liar, land there, and tear the place down—timbers and stones."</w:t>
             </w:r>
           </w:p>
         </w:tc>
@@ -4377,7 +4377,7 @@
               <w:rPr>
                 <w:sz w:val="18"/>
               </w:rPr>
-              <w:t>He said, "They're taking it east to Shinar. They're going to build a special place for it, and once it's ready, the basket will be stored there for good."</w:t>
+              <w:t>He said, "They're taking it east to Shinar. They're going to build a garage to house it, and once it's ready, the basket will be stored there for good."</w:t>
             </w:r>
           </w:p>
         </w:tc>
@@ -4400,7 +4400,7 @@
               <w:rPr>
                 <w:sz w:val="18"/>
               </w:rPr>
-              <w:t>천사가 말했어. "동쪽 시날 땅으로. 거기다가 저걸 보관할 집을 지을 거래. 집이 완성되면, 그 바구니는 거기에 영원히 보관될 거야."</w:t>
+              <w:t>천사가 말했어. "동쪽 시날 땅으로. 거기다가 저걸 보관할 창고를 지을 거래. 창고가 완성되면, 그 바구니는 거기에 영원히 보관될 거야."</w:t>
             </w:r>
           </w:p>
         </w:tc>
@@ -4515,7 +4515,7 @@
               <w:rPr>
                 <w:sz w:val="18"/>
               </w:rPr>
-              <w:t>Yo, I looked up again and saw something else totally wild. Four chariots were just blasting out from between these two mountains, and the mountains were made of bronze. Insane.</w:t>
+              <w:t>Yo, I looked up again and saw something else crazy. Four chariots were just blasting out from between these two mountains, and the mountains were made of bronze. Insane.</w:t>
             </w:r>
           </w:p>
         </w:tc>
@@ -4657,7 +4657,7 @@
               <w:rPr>
                 <w:sz w:val="18"/>
               </w:rPr>
-              <w:t>I was like, 'Yo, angel dude, what's the deal with this?'</w:t>
+              <w:t>I was like, 'Yo, angel, what's the deal with this?'</w:t>
             </w:r>
           </w:p>
         </w:tc>
@@ -5363,7 +5363,7 @@
               <w:rPr>
                 <w:sz w:val="18"/>
               </w:rPr>
-              <w:t>God-of-the-Angel-Armies gave me this message for all the people and the priests: “Yo, when you were fasting all dramatically in the fifth and seventh months for the last seventy years, were you *really* doing that for me? And when you had big parties and feasts, was that for me either? Lowkey, no. You're all about the religious rules, but I'm all about the people.</w:t>
+              <w:t>God-of-the-Angel-Armies gave me this message for all the people and the priests: “Yo, when you were fasting all dramatically in the fifth and seventh months for the last seventy years, were you *really* doing that for me? And when you had big parties and feasts, was that for me either? Honestly, no. You're all about the religious rules, but I'm all about the people.</w:t>
             </w:r>
           </w:p>
         </w:tc>
@@ -6701,7 +6701,7 @@
               <w:rPr>
                 <w:sz w:val="18"/>
               </w:rPr>
-              <w:t>"Alright, get it together. Listen up, you who are hearing what I'm saying through the prophets. The Temple of the God of the Angel Armies is back. The Temple is being rebuilt. We've been through some tough times, for sure. You were working for basically nothing, and the streets were sketchy. You always had to watch your back. I had turned the world into a war zone.</w:t>
+              <w:t>"Alright, get it together. Listen up, you who are hearing what I'm saying through the prophets. The Temple of the God of the Angel Armies is back. The Temple is being rebuilt. We've been through some tough times, for sure. You were working for basically nothing, and the streets were sketchy. You always had to watch your back. I had turned the world into a war zone."</w:t>
             </w:r>
           </w:p>
         </w:tc>
@@ -8445,7 +8445,7 @@
               <w:rPr>
                 <w:sz w:val="18"/>
               </w:rPr>
-              <w:t>God's like, "I'm gonna make the people of Judah strong; I'm gonna rescue the people of Joseph. I see what they've been through, and I'm gonna give them a total reset. It's a fresh start, like none of the bad stuff ever happened. Why? 'Cause I'm their God, and I'll do whatever it takes for them. The people of Ephraim will be famous, their lives just filled with good vibes. Their kids will get in on it too—man, they'll see how blessed they are by God! I'll just give a signal, and they'll all come running back. I've freed them, and they're gonna thrive, for real. Even though I scattered them all over the world, they'll remember me way out there. They'll pass down the stories to their kids, and they will come back home. I'll bring them back from Egypt in the west and gather them from Assyria in the east. I'll bring them back to the good land of Gilead and Lebanon. The whole place will be filled with people coming home. They'll get through any tough times, pushing past any obstacle. Huge rivers will seem like nothing. Flashy Assyria will get exposed, and bully Egypt will be shown for the fraud it is. But my people—yo, I'll make them super strong, God-level strong! And they'll live life my way." That's a promise from God!</w:t>
+              <w:t>God's like, "I'm gonna make the people of Judah strong; I'm gonna rescue the people of Joseph. I see what they've been through, and I'm gonna give them a total reset. It's a fresh start, like none of the bad stuff ever happened. Why? 'Cause I'm their God, and I'll do whatever it takes for them. The people of Ephraim will be famous, their lives just filled with good vibes. Their kids will get in on it too—man, they'll see how blessed they are by God! I'll just give a signal, and they'll all come running back. I've freed them, and they're gonna thrive, for real. Even though I scattered them all over the world, they'll remember me way out there. They'll pass down the stories to their kids, and they will come back home. I'll bring them back from Egypt in the west and gather them from Assyria in the east. I'll bring them back to sweet Gilead, back to leafy Lebanon. The whole place will be filled with people coming home. They'll sail through troubled seas, brush aside the brash ocean waves. Huge rivers will seem like nothing. Flashy Assyria will get exposed, and bully Egypt will be shown for the fraud it is. But my people—yo, I'll make them super strong, God-level strong! And they'll live life my way." That's a promise from God!</w:t>
             </w:r>
           </w:p>
         </w:tc>
@@ -8583,7 +8583,7 @@
               <w:rPr>
                 <w:sz w:val="18"/>
               </w:rPr>
-              <w:t>Alright, Lebanon, you think you're so great? Open up your gates, 'cause a fire is coming for your famous trees. All you big-shot pine trees, get ready to cry. And you cedars? You're basically just firewood now. Hey, Bashan oaks, you can weep too. Your super thick forest? It's about to be a field of stumps. You hear that? That's the sound of shepherds freaking out 'cause they just lost everything. And the lions? They're roaring mad 'cause their jungle home in the Jordan is totally wrecked. Make way for the people coming back from exile!</w:t>
+              <w:t>Alright, Lebanon, you think you're so great? Open up your borders to the immigrants, proud Lebanon—fire is coming for your famous trees. All you big-shot pine trees, get ready to cry. And you cedars? You're basically just firewood now. Hey, Bashan oaks, you can weep too. Your super thick forest? It's about to be a field of stumps. You hear that? That's the sound of shepherds freaking out 'cause they just lost everything. And the lions? They're roaring mad 'cause their jungle home in the Jordan is totally wrecked. Make way for the people coming back from exile!</w:t>
             </w:r>
           </w:p>
         </w:tc>
@@ -8606,7 +8606,7 @@
               <w:rPr>
                 <w:sz w:val="18"/>
               </w:rPr>
-              <w:t>야, 레바논, 너네 좀 대단하다고 생각하지? 문 열어봐, 불이 너네 유명한 나무들 다 태워버릴 거임. 소나무들아, 이제 울 시간이다. 백향목 너네도. 너네 그냥 땔감 신세임. 바산의 상수리나무들아, 너네도 울어라. 너네 빽빽한 숲 이제 그냥 그루터기 밭 됨. 저기 목자들 우는 소리 들리냐? 걔네 전 재산 다 날렸대. 사자들 화난 소리 들림? 요르단의 그 대단한 정글이 다 망했대. 포로였다가 돌아오는 사람들 자리나 만들어줘라!</w:t>
+              <w:t>야, 레바논, 너네 좀 대단하다고 생각하지? 이민자들을 위해 국경을 열어라, 자랑스러운 레바논아. 불이 너네 유명한 나무들 다 태워버릴 거임. 소나무들아, 이제 울 시간이다. 백향목 너네도. 너네 그냥 땔감 신세임. 바산의 상수리나무들아, 너네도 울어라. 너네 빽빽한 숲 이제 그냥 그루터기 밭 됨. 저기 목자들 우는 소리 들리냐? 걔네 전 재산 다 날렸대. 사자들 화난 소리 들림? 요르단의 그 대단한 정글이 다 망했대. 포로였다가 돌아오는 사람들 자리나 만들어줘라!</w:t>
             </w:r>
           </w:p>
         </w:tc>
@@ -8677,7 +8677,7 @@
               <w:rPr>
                 <w:sz w:val="18"/>
               </w:rPr>
-              <w:t>하나님이 나한테 명령하셨음. "곧 잡혀 먹힐 양들을 좀 돌봐라." 걔네를 사는 사람들은 바로 잡아서 돈 벌려고 할 거래. 근데 더 대박인 건, 그래도 아무도 뭐라 안 한다는 거임. 파는 사람들은 "완전 좋다! 하나님이 내 편이네. 난 이제 부자임!" 이럴 거고. 지금 있는 목자들은 양들한테 진짜 1도 관심이 없대.</w:t>
+              <w:t>하나님이 나한테 명령하셨음. "곧 잡혀 먹힐 양들을 좀 돌봐라." 걔네를 사는 사람들은 바로 잡아서 돈 벌려고 할 거래. 근데 더 충격인 건, 그래도 아무도 뭐라 안 한다는 거임. 파는 사람들은 "완전 좋다! 하나님이 내 편이네. 난 이제 부자임!" 이럴 거고. 지금 있는 목자들은 양들한테 진짜 1도 관심이 없대.</w:t>
             </w:r>
           </w:p>
         </w:tc>
@@ -8748,7 +8748,7 @@
               <w:rPr>
                 <w:sz w:val="18"/>
               </w:rPr>
-              <w:t>하나님이 선포하셨음. "나 이제 이 땅 사람들한테서 손 뗄 거임. 이제부터 각자도생임. 완전 약육강식, 서바이벌 게임 시작이고, 아무도 나한테 도와달라고 하지 마셈."</w:t>
+              <w:t>하나님이 선포하셨음. "나 이제 이 땅 사람들한테서 손 뗄 거임. 이제부터 각자도생임. 완전 약육강식, 적자생존이고, 아무도 나한테 도와달라고 하지 마셈."</w:t>
             </w:r>
           </w:p>
         </w:tc>
@@ -8796,7 +8796,7 @@
               <w:rPr>
                 <w:sz w:val="18"/>
               </w:rPr>
-              <w:t>So I took over from the trashy, money-hungry owners and started shepherding the sheep that were marked for slaughter. I got myself two shepherd staffs. I named one 'Grace' and the other 'Unity.' Then I got to work. In less than a month, I got rid of the three corrupt shepherds. I was so over their drama—and they couldn't stand me either.</w:t>
+              <w:t>So I took over from the trashy, money-hungry owners and started shepherding the sheep that were marked for slaughter. I got myself two shepherd staffs. I named one 'Lovely' and the other 'Harmony.' Then I got to work. In less than a month, I got rid of the three corrupt shepherds. I was so over their drama—and they couldn't stand me either.</w:t>
             </w:r>
           </w:p>
         </w:tc>
@@ -8819,7 +8819,7 @@
               <w:rPr>
                 <w:sz w:val="18"/>
               </w:rPr>
-              <w:t>그래서 내가 그 돈만 밝히는 엉망 주인들한테서 양들을 넘겨받아서 돌보기 시작했음. 잡혀 먹힐 운명인 양들이었지. 지팡이 두 개를 구해서 하나는 '은총', 다른 하나는 '연합'이라고 이름 붙였음. 그리고 바로 일 시작함. 한 달도 안 돼서 그 부패한 목자 세 명을 쫓아냈음. 나도 걔네 꼴 보기 싫었고, 걔네도 날 엄청 싫어했거든.</w:t>
+              <w:t>그래서 내가 그 돈만 밝히는 엉망 주인들한테서 양들을 넘겨받아서 돌보기 시작했음. 잡혀 먹힐 운명인 양들이었지. 지팡이 두 개를 구해서 하나는 '사랑스러움', 다른 하나는 '화합'이라고 이름 붙였음. 그리고 바로 일 시작함. 한 달도 안 돼서 그 부패한 목자 세 명을 쫓아냈음. 나도 걔네 꼴 보기 싫었고, 걔네도 날 엄청 싫어했거든.</w:t>
             </w:r>
           </w:p>
         </w:tc>
@@ -8867,7 +8867,7 @@
               <w:rPr>
                 <w:sz w:val="18"/>
               </w:rPr>
-              <w:t>But then I got tired of the sheep too and was like, 'I'm out. No more shepherding from me. If you die, you die. If you get attacked, you get attacked. Whoever's left can just eat each other for all I care.'</w:t>
+              <w:t>But then I got tired of the sheep too and was like, 'I'm out. No more shepherding from me. If you die, you die. If you get attacked, you get attacked. Whoever survives can just eat what's left.'</w:t>
             </w:r>
           </w:p>
         </w:tc>
@@ -8890,7 +8890,7 @@
               <w:rPr>
                 <w:sz w:val="18"/>
               </w:rPr>
-              <w:t>근데 나도 양들한테 질려버린 거임. 그래서 말했지. "나 이제 너희랑 끝임. 더 이상 목자 노릇 안 해. 죽든 말든, 공격당하든 말든 알아서 해. 살아남는 사람들은 남은 애들 잡아먹든가."</w:t>
+              <w:t>근데 나도 양들한테 질려버린 거임. 그래서 말했지. "나 이제 너희랑 끝임. 더 이상 목자 노릇 안 해. 죽든 말든, 공격당하든 말든 알아서 해. 살아남은 자는 남은 것을 먹어라."</w:t>
             </w:r>
           </w:p>
         </w:tc>
@@ -8938,7 +8938,7 @@
               <w:rPr>
                 <w:sz w:val="18"/>
               </w:rPr>
-              <w:t>Then I took my staff named 'Grace' and snapped it in half. Just like that, the awesome promise I had with all the people was broken. The greedy owners saw me do it and knew it was a message from God.</w:t>
+              <w:t>Then I took my staff named 'Lovely' and snapped it in half. Just like that, the awesome promise I had with all the people was broken. The greedy owners saw me do it and knew it was a message from God.</w:t>
             </w:r>
           </w:p>
         </w:tc>
@@ -8961,7 +8961,7 @@
               <w:rPr>
                 <w:sz w:val="18"/>
               </w:rPr>
-              <w:t>그러고 나서 '은총'이라고 이름 붙인 지팡이를 부러뜨려 버렸음. 내가 모든 민족이랑 맺었던 그 대단한 언약을 깨버린 거임. 한 방에 지팡이랑 언약 둘 다 박살남. 돈에 엄청난 주인들이 내가 그러는 걸 보고 이게 하나님의 뜻인 걸 알았대.</w:t>
+              <w:t>그러고 나서 '사랑스러움'이라고 이름 붙인 지팡이를 부러뜨려 버렸음. 내가 모든 민족이랑 맺었던 그 대단한 언약을 깨버린 거임. 한 방에 지팡이랑 언약 둘 다 박살남. 돈에 엄청난 주인들이 내가 그러는 걸 보고 이게 하나님의 뜻인 걸 알았대.</w:t>
             </w:r>
           </w:p>
         </w:tc>
@@ -9151,7 +9151,7 @@
               <w:rPr>
                 <w:sz w:val="18"/>
               </w:rPr>
-              <w:t>Then I broke my other staff, 'Unity,' and snapped it in half, breaking the family bond between Judah and Israel.</w:t>
+              <w:t>Then I broke my other staff, 'Harmony,' and snapped it in half, breaking the family bond between Judah and Israel.</w:t>
             </w:r>
           </w:p>
         </w:tc>
@@ -9174,7 +9174,7 @@
               <w:rPr>
                 <w:sz w:val="18"/>
               </w:rPr>
-              <w:t>그리고 다른 지팡이, '연합'도 부러뜨려 버렸음. 유다랑 이스라엘의 형제 관계를 끊어버린 거임.</w:t>
+              <w:t>그리고 다른 지팡이, '화합'도 부러뜨려 버렸음. 유다랑 이스라엘의 형제 관계를 끊어버린 거임.</w:t>
             </w:r>
           </w:p>
         </w:tc>
@@ -10224,7 +10224,7 @@
               <w:rPr>
                 <w:sz w:val="18"/>
               </w:rPr>
-              <w:t>God of the Angel Armies says, 'On that day, I'm deleting all the fake, store-bought gods from existence. Their names will be totally erased from memory. People will be like, 'Never heard of 'em.' And I'm kicking out all those prophets who were polluting the world with their toxic talk.' And get this—if someone keeps trying to spread those toxic, polluting words, their own parents will step up and be like, 'Dude, you're done. Your lies about God are putting everyone at risk.' And then, no joke, they'll take him out right then and there while he's prophesying. His own parents!</w:t>
+              <w:t>God of the Angel Armies says, 'On that day, I'm deleting all the fake, store-bought gods from existence. Their names will be totally erased from memory. People will be like, 'Never heard of 'em.' And I'm kicking out all those prophets who were polluting the world with their toxic talk.' And get this—if someone keeps trying to spread those toxic, polluting words, their own parents will step up and be like, 'You're done. Your lies about God are putting everyone at risk.' And then, no joke, they'll take him out right then and there while he's prophesying. His own parents!</w:t>
             </w:r>
           </w:p>
         </w:tc>
@@ -10366,7 +10366,7 @@
               <w:rPr>
                 <w:sz w:val="18"/>
               </w:rPr>
-              <w:t>Then God of the Angel Armies gives this command: 'Sword, go after my shepherd, my right-hand man! Strike the shepherd, and the sheep will scatter. I'll even turn my back on the little lambs.' God's decree says that all over the land, two-thirds will be wiped out, but one-third will make it through. And that surviving third? I'm gonna put them through the fire, like refining silver, and test them like gold to see if they're the real deal. Then they'll call my name, and I'll answer them personally. I'll say, 'You are my people.' And they'll say, 'God is my God!'</w:t>
+              <w:t>Then God of the Angel Armies gives this command: 'Sword, go after my shepherd, my right-hand man! Strike the shepherd, and the sheep will scatter. I'll even turn my hand against the little lambs.' God's decree says that all over the land, two-thirds will be wiped out, but one-third will make it through. And that surviving third? I'm gonna put them through the fire, like refining silver, and test them like gold to see if they're the real deal. Then they'll call my name, and I'll answer them personally. I'll say, 'You are my people.' And they'll say, 'God is my God!'</w:t>
             </w:r>
           </w:p>
         </w:tc>
@@ -10389,7 +10389,7 @@
               <w:rPr>
                 <w:sz w:val="18"/>
               </w:rPr>
-              <w:t>만군의 주님이 명령하셨대. '칼아, 내 목자, 내 오른팔을 향해 움직여라! 목자를 쳐라! 양들을 흩어버려라! 어린 양들에게조차 등을 돌릴 것이다!' 하나님이 말씀하시길, 온 땅의 3분의 2는 망하고 3분의 1만 살아남을 거래. 그리고 그 살아남은 3분의 1을 내가 불 속에서 단련시킬 거임. 은을 제련하듯이, 금의 순도를 시험하듯이, 걔네가 찐인지 아닌지 시험할 거라고. 그러면 걔네가 내 이름을 부르며 기도할 거고, 난 직접 대답해 줄 거야. 난 '얘네가 내 백성이다'라고 말할 거고, 걔네는 '하나님은 나의 하나님이십니다!'라고 말하게 될 거래.</w:t>
+              <w:t>만군의 주님이 명령하셨대. '칼아, 내 목자, 내 오른팔을 향해 움직여라! 목자를 쳐라! 양들을 흩어버려라! 어린 양들에게조차 내 손을 돌릴 것이다!' 하나님이 말씀하시길, 온 땅의 3분의 2는 망하고 3분의 1만 살아남을 거래. 그리고 그 살아남은 3분의 1을 내가 불 속에서 단련시킬 거임. 은을 제련하듯이, 금의 순도를 시험하듯이, 걔네가 찐인지 아닌지 시험할 거라고. 그러면 걔네가 내 이름을 부르며 기도할 거고, 난 직접 대답해 줄 거야. 난 '얘네가 내 백성이다'라고 말할 거고, 걔네는 '하나님은 나의 하나님이십니다!'라고 말하게 될 거래.</w:t>
             </w:r>
           </w:p>
         </w:tc>
@@ -10740,7 +10740,7 @@
               <w:rPr>
                 <w:sz w:val="18"/>
               </w:rPr>
-              <w:t>그날은 진짜 대박일 거야! 예루살렘에서 신선한 강물이 흘러나오는데, 절반은 동쪽 바다로, 절반은 서쪽 바다로, 여름이든 겨울이든 일 년 내내 흐를 거래.</w:t>
+              <w:t>그날은 진짜 엄청날 거야! 예루살렘에서 신선한 강물이 흘러나오는데, 절반은 동쪽 바다로, 절반은 서쪽 바다로, 여름이든 겨울이든 일 년 내내 흐를 거래.</w:t>
             </w:r>
           </w:p>
         </w:tc>
@@ -10930,7 +10930,7 @@
               <w:rPr>
                 <w:sz w:val="18"/>
               </w:rPr>
-              <w:t>But here's what's gonna happen to everyone who fought against Jerusalem: God will hit them with a gnarly plague. People's skin will rot right off their bones while they're still walking around. Their eyes will rot in their sockets, and their tongues will rot in their mouths. People will literally be dying on their feet! It'll be mass chaos when that happens—total panic. Soldiers will start fighting and killing each other—it's gonna be terrifying. And then Judah will jump into the fight.</w:t>
+              <w:t>But here's what's gonna happen to everyone who fought against Jerusalem: God will hit them with a horrible plague. People's skin will rot right off their bones while they're still walking around. Their eyes will rot in their sockets, and their tongues will rot in their mouths. People will literally be dying on their feet! It'll be mass chaos when that happens—total panic. Soldiers will start fighting and killing each other—it's gonna be terrifying. And then Judah will jump into the fight.</w:t>
             </w:r>
           </w:p>
         </w:tc>

</xml_diff>

<commit_message>
Zechariah 배지 정밀화 (OT 전수조사): 8장 7곳 (EN+KO) — 태그 과소/과대 표기 교정. 독스 14/14 export-back OK.
</commit_message>
<xml_diff>
--- a/gdocs_build/Zechariah.docx
+++ b/gdocs_build/Zechariah.docx
@@ -5762,7 +5762,7 @@
                 <w:b/>
                 <w:sz w:val="16"/>
               </w:rPr>
-              <w:t>1-2</w:t>
+              <w:t>1</w:t>
             </w:r>
           </w:p>
           <w:p>
@@ -5809,7 +5809,7 @@
                 <w:b/>
                 <w:sz w:val="16"/>
               </w:rPr>
-              <w:t>1-2</w:t>
+              <w:t>1</w:t>
             </w:r>
           </w:p>
           <w:p>
@@ -5832,7 +5832,7 @@
                 <w:b/>
                 <w:sz w:val="16"/>
               </w:rPr>
-              <w:t>1-2</w:t>
+              <w:t>1</w:t>
             </w:r>
           </w:p>
           <w:p>
@@ -6141,7 +6141,7 @@
                 <w:b/>
                 <w:sz w:val="16"/>
               </w:rPr>
-              <w:t>4</w:t>
+              <w:t>4-5</w:t>
             </w:r>
           </w:p>
           <w:p>
@@ -6172,7 +6172,7 @@
                 <w:b/>
                 <w:sz w:val="16"/>
               </w:rPr>
-              <w:t>4</w:t>
+              <w:t>4-5</w:t>
             </w:r>
           </w:p>
           <w:p>
@@ -6195,7 +6195,7 @@
                 <w:b/>
                 <w:sz w:val="16"/>
               </w:rPr>
-              <w:t>4</w:t>
+              <w:t>4-5</w:t>
             </w:r>
           </w:p>
           <w:p>
@@ -6441,7 +6441,7 @@
                 <w:b/>
                 <w:sz w:val="16"/>
               </w:rPr>
-              <w:t>7</w:t>
+              <w:t>7-8</w:t>
             </w:r>
           </w:p>
           <w:p>
@@ -6472,7 +6472,7 @@
                 <w:b/>
                 <w:sz w:val="16"/>
               </w:rPr>
-              <w:t>7</w:t>
+              <w:t>7-8</w:t>
             </w:r>
           </w:p>
           <w:p>
@@ -6495,7 +6495,7 @@
                 <w:b/>
                 <w:sz w:val="16"/>
               </w:rPr>
-              <w:t>7</w:t>
+              <w:t>7-8</w:t>
             </w:r>
           </w:p>
           <w:p>
@@ -6591,7 +6591,7 @@
                 <w:b/>
                 <w:sz w:val="16"/>
               </w:rPr>
-              <w:t>9</w:t>
+              <w:t>9-10</w:t>
             </w:r>
           </w:p>
           <w:p>
@@ -6622,7 +6622,7 @@
                 <w:b/>
                 <w:sz w:val="16"/>
               </w:rPr>
-              <w:t>9</w:t>
+              <w:t>9-10</w:t>
             </w:r>
           </w:p>
           <w:p>
@@ -6645,7 +6645,7 @@
                 <w:b/>
                 <w:sz w:val="16"/>
               </w:rPr>
-              <w:t>9</w:t>
+              <w:t>9-10</w:t>
             </w:r>
           </w:p>
           <w:p>
@@ -6962,7 +6962,7 @@
                 <w:b/>
                 <w:sz w:val="16"/>
               </w:rPr>
-              <w:t>14</w:t>
+              <w:t>14-17</w:t>
             </w:r>
           </w:p>
           <w:p>
@@ -6993,7 +6993,7 @@
                 <w:b/>
                 <w:sz w:val="16"/>
               </w:rPr>
-              <w:t>14</w:t>
+              <w:t>14-17</w:t>
             </w:r>
           </w:p>
           <w:p>
@@ -7016,7 +7016,7 @@
                 <w:b/>
                 <w:sz w:val="16"/>
               </w:rPr>
-              <w:t>14</w:t>
+              <w:t>14-17</w:t>
             </w:r>
           </w:p>
           <w:p>
@@ -7112,7 +7112,7 @@
                 <w:b/>
                 <w:sz w:val="16"/>
               </w:rPr>
-              <w:t>18</w:t>
+              <w:t>18-19</w:t>
             </w:r>
           </w:p>
           <w:p>
@@ -7143,7 +7143,7 @@
                 <w:b/>
                 <w:sz w:val="16"/>
               </w:rPr>
-              <w:t>18</w:t>
+              <w:t>18-19</w:t>
             </w:r>
           </w:p>
           <w:p>
@@ -7166,7 +7166,7 @@
                 <w:b/>
                 <w:sz w:val="16"/>
               </w:rPr>
-              <w:t>18</w:t>
+              <w:t>18-19</w:t>
             </w:r>
           </w:p>
           <w:p>
@@ -7262,7 +7262,7 @@
                 <w:b/>
                 <w:sz w:val="16"/>
               </w:rPr>
-              <w:t>20</w:t>
+              <w:t>20-21</w:t>
             </w:r>
           </w:p>
           <w:p>
@@ -7293,7 +7293,7 @@
                 <w:b/>
                 <w:sz w:val="16"/>
               </w:rPr>
-              <w:t>20</w:t>
+              <w:t>20-21</w:t>
             </w:r>
           </w:p>
           <w:p>
@@ -7316,7 +7316,7 @@
                 <w:b/>
                 <w:sz w:val="16"/>
               </w:rPr>
-              <w:t>20</w:t>
+              <w:t>20-21</w:t>
             </w:r>
           </w:p>
           <w:p>

</xml_diff>